<commit_message>
docs(content): incorpora guias de lecciones y scripts SQL de mantenimiento
- Actualiza la guia de usuario y agrega utilitario para generar guia tecnica

- Documenta lineamientos tecnicos, estilos, pedagogia e insercion para lecciones

- Incluye plantillas y scripts finales SQL para authoring y seed de contenidos
</commit_message>
<xml_diff>
--- a/Docs/Guias/Finales/GUIA_USUARIO_ACC.docx
+++ b/Docs/Guias/Finales/GUIA_USUARIO_ACC.docx
@@ -20,7 +20,7 @@
           <w:noProof/>
         </w:rPr>
         <w:drawing>
-          <wp:inline distT="0" distB="0" distL="0" distR="0" wp14:anchorId="32EB57EE" wp14:editId="099918B6">
+          <wp:inline distT="0" distB="0" distL="0" distR="0" wp14:anchorId="360BE458" wp14:editId="0143D379">
             <wp:extent cx="5612130" cy="2970530"/>
             <wp:effectExtent l="0" t="0" r="0" b="0"/>
             <wp:docPr id="438044789" name="Imagen 2" descr="Texto&#10;&#10;El contenido generado por IA puede ser incorrecto."/>
@@ -330,6 +330,12 @@
     </w:p>
     <w:sdt>
       <w:sdtPr>
+        <w:rPr>
+          <w:rFonts w:ascii="Times New Roman" w:eastAsia="Times New Roman" w:hAnsi="Times New Roman" w:cstheme="minorBidi"/>
+          <w:b w:val="0"/>
+          <w:bCs w:val="0"/>
+          <w:szCs w:val="22"/>
+        </w:rPr>
         <w:id w:val="1014878122"/>
         <w:docPartObj>
           <w:docPartGallery w:val="Table of Contents"/>
@@ -338,9 +344,7 @@
       </w:sdtPr>
       <w:sdtEndPr>
         <w:rPr>
-          <w:rFonts w:ascii="Times New Roman" w:eastAsia="Times New Roman" w:hAnsi="Times New Roman" w:cstheme="minorBidi"/>
           <w:noProof/>
-          <w:szCs w:val="22"/>
         </w:rPr>
       </w:sdtEndPr>
       <w:sdtContent>
@@ -3917,386 +3921,1070 @@
       </w:pPr>
     </w:p>
     <w:p>
-      <w:pPr/>
+      <w:pPr>
+        <w:rPr>
+          <w:lang w:val="es-MX"/>
+        </w:rPr>
+      </w:pPr>
     </w:p>
     <w:p>
       <w:pPr>
         <w:pStyle w:val="ACCBody"/>
-      </w:pPr>
-      <w:r>
-        <w:t>Las secciones numeradas que siguen desarrollan cada modulo con mayor detalle.</w:t>
+        <w:rPr>
+          <w:lang w:val="es-MX"/>
+        </w:rPr>
+      </w:pPr>
+      <w:r>
+        <w:rPr>
+          <w:lang w:val="es-MX"/>
+        </w:rPr>
+        <w:t xml:space="preserve">Las secciones numeradas que siguen desarrollan cada </w:t>
+      </w:r>
+      <w:proofErr w:type="spellStart"/>
+      <w:r>
+        <w:rPr>
+          <w:lang w:val="es-MX"/>
+        </w:rPr>
+        <w:t>modulo</w:t>
+      </w:r>
+      <w:proofErr w:type="spellEnd"/>
+      <w:r>
+        <w:rPr>
+          <w:lang w:val="es-MX"/>
+        </w:rPr>
+        <w:t xml:space="preserve"> con mayor detalle.</w:t>
       </w:r>
     </w:p>
     <w:p>
       <w:pPr>
         <w:pStyle w:val="ACCNumbered"/>
-      </w:pPr>
-      <w:r>
+        <w:rPr>
+          <w:lang w:val="es-MX"/>
+        </w:rPr>
+      </w:pPr>
+      <w:r>
+        <w:rPr>
+          <w:lang w:val="es-MX"/>
+        </w:rPr>
         <w:t>7. Administra perfil, seguridad y preferencias desde Cuenta.</w:t>
       </w:r>
     </w:p>
     <w:p>
       <w:pPr>
         <w:pStyle w:val="ACCNumbered"/>
-      </w:pPr>
-      <w:r>
+        <w:rPr>
+          <w:lang w:val="es-MX"/>
+        </w:rPr>
+      </w:pPr>
+      <w:r>
+        <w:rPr>
+          <w:lang w:val="es-MX"/>
+        </w:rPr>
         <w:t>6. Usa Charp para resolver dudas concretas durante el estudio.</w:t>
       </w:r>
     </w:p>
     <w:p>
       <w:pPr>
         <w:pStyle w:val="ACCNumbered"/>
-      </w:pPr>
-      <w:r>
+        <w:rPr>
+          <w:lang w:val="es-MX"/>
+        </w:rPr>
+      </w:pPr>
+      <w:r>
+        <w:rPr>
+          <w:lang w:val="es-MX"/>
+        </w:rPr>
         <w:t>5. Consulta Biblioteca cuando necesites reforzar conceptos o revisar ejemplos.</w:t>
       </w:r>
     </w:p>
     <w:p>
       <w:pPr>
         <w:pStyle w:val="ACCNumbered"/>
-      </w:pPr>
-      <w:r>
-        <w:t>4. Avanza en los contenidos de Guia segun la secuencia academica asignada.</w:t>
+        <w:rPr>
+          <w:lang w:val="es-MX"/>
+        </w:rPr>
+      </w:pPr>
+      <w:r>
+        <w:rPr>
+          <w:lang w:val="es-MX"/>
+        </w:rPr>
+        <w:t xml:space="preserve">4. Avanza en los contenidos de </w:t>
+      </w:r>
+      <w:proofErr w:type="spellStart"/>
+      <w:r>
+        <w:rPr>
+          <w:lang w:val="es-MX"/>
+        </w:rPr>
+        <w:t>Guia</w:t>
+      </w:r>
+      <w:proofErr w:type="spellEnd"/>
+      <w:r>
+        <w:rPr>
+          <w:lang w:val="es-MX"/>
+        </w:rPr>
+        <w:t xml:space="preserve"> </w:t>
+      </w:r>
+      <w:proofErr w:type="spellStart"/>
+      <w:r>
+        <w:rPr>
+          <w:lang w:val="es-MX"/>
+        </w:rPr>
+        <w:t>segun</w:t>
+      </w:r>
+      <w:proofErr w:type="spellEnd"/>
+      <w:r>
+        <w:rPr>
+          <w:lang w:val="es-MX"/>
+        </w:rPr>
+        <w:t xml:space="preserve"> la secuencia </w:t>
+      </w:r>
+      <w:proofErr w:type="spellStart"/>
+      <w:r>
+        <w:rPr>
+          <w:lang w:val="es-MX"/>
+        </w:rPr>
+        <w:t>academica</w:t>
+      </w:r>
+      <w:proofErr w:type="spellEnd"/>
+      <w:r>
+        <w:rPr>
+          <w:lang w:val="es-MX"/>
+        </w:rPr>
+        <w:t xml:space="preserve"> asignada.</w:t>
       </w:r>
     </w:p>
     <w:p>
       <w:pPr>
         <w:pStyle w:val="ACCNumbered"/>
-      </w:pPr>
-      <w:r>
+        <w:rPr>
+          <w:lang w:val="es-MX"/>
+        </w:rPr>
+      </w:pPr>
+      <w:r>
+        <w:rPr>
+          <w:lang w:val="es-MX"/>
+        </w:rPr>
         <w:t>3. Organiza tus actividades desde Agenda.</w:t>
       </w:r>
     </w:p>
     <w:p>
       <w:pPr>
         <w:pStyle w:val="ACCNumbered"/>
-      </w:pPr>
-      <w:r>
+        <w:rPr>
+          <w:lang w:val="es-MX"/>
+        </w:rPr>
+      </w:pPr>
+      <w:r>
+        <w:rPr>
+          <w:lang w:val="es-MX"/>
+        </w:rPr>
         <w:t>2. Revisa Resumen para identificar avance, evaluaciones y pendientes inmediatos.</w:t>
       </w:r>
     </w:p>
     <w:p>
       <w:pPr>
         <w:pStyle w:val="ACCNumbered"/>
-      </w:pPr>
-      <w:r>
-        <w:t>1. Inicia sesion con tu cuenta de ACC.</w:t>
+        <w:rPr>
+          <w:lang w:val="es-MX"/>
+        </w:rPr>
+      </w:pPr>
+      <w:r>
+        <w:rPr>
+          <w:lang w:val="es-MX"/>
+        </w:rPr>
+        <w:t xml:space="preserve">1. Inicia </w:t>
+      </w:r>
+      <w:proofErr w:type="spellStart"/>
+      <w:r>
+        <w:rPr>
+          <w:lang w:val="es-MX"/>
+        </w:rPr>
+        <w:t>sesion</w:t>
+      </w:r>
+      <w:proofErr w:type="spellEnd"/>
+      <w:r>
+        <w:rPr>
+          <w:lang w:val="es-MX"/>
+        </w:rPr>
+        <w:t xml:space="preserve"> con tu cuenta de ACC.</w:t>
       </w:r>
     </w:p>
     <w:p>
       <w:pPr>
         <w:pStyle w:val="ACCBody"/>
-      </w:pPr>
-      <w:r>
+        <w:rPr>
+          <w:lang w:val="es-MX"/>
+        </w:rPr>
+      </w:pPr>
+      <w:r>
+        <w:rPr>
+          <w:lang w:val="es-MX"/>
+        </w:rPr>
         <w:t>Se recomienda seguir este flujo general para aprovechar la plataforma de forma ordenada.</w:t>
       </w:r>
     </w:p>
     <w:p>
       <w:pPr>
         <w:pStyle w:val="Heading2"/>
-      </w:pPr>
-      <w:r>
-        <w:t>Guia de uso</w:t>
-      </w:r>
-    </w:p>
-    <w:p>
-      <w:pPr/>
+        <w:rPr>
+          <w:lang w:val="es-MX"/>
+        </w:rPr>
+      </w:pPr>
+      <w:proofErr w:type="spellStart"/>
+      <w:r>
+        <w:rPr>
+          <w:lang w:val="es-MX"/>
+        </w:rPr>
+        <w:t>Guia</w:t>
+      </w:r>
+      <w:proofErr w:type="spellEnd"/>
+      <w:r>
+        <w:rPr>
+          <w:lang w:val="es-MX"/>
+        </w:rPr>
+        <w:t xml:space="preserve"> de uso</w:t>
+      </w:r>
+    </w:p>
+    <w:p>
+      <w:pPr>
+        <w:rPr>
+          <w:lang w:val="es-MX"/>
+        </w:rPr>
+      </w:pPr>
     </w:p>
     <w:p>
       <w:pPr>
         <w:pStyle w:val="ACCBullet"/>
-      </w:pPr>
-      <w:r>
+        <w:rPr>
+          <w:lang w:val="es-MX"/>
+        </w:rPr>
+      </w:pPr>
+      <w:r>
+        <w:rPr>
+          <w:lang w:val="es-MX"/>
+        </w:rPr>
         <w:t>- Cuenta agrupa perfil, seguridad y configuraciones personales.</w:t>
       </w:r>
     </w:p>
     <w:p>
       <w:pPr>
         <w:pStyle w:val="ACCBullet"/>
-      </w:pPr>
-      <w:r>
+        <w:rPr>
+          <w:lang w:val="es-MX"/>
+        </w:rPr>
+      </w:pPr>
+      <w:r>
+        <w:rPr>
+          <w:lang w:val="es-MX"/>
+        </w:rPr>
         <w:t>- Charp funciona como asistente para dudas puntuales sobre C#.</w:t>
       </w:r>
     </w:p>
     <w:p>
       <w:pPr>
         <w:pStyle w:val="ACCBullet"/>
-      </w:pPr>
-      <w:r>
-        <w:t>- Biblioteca reune recursos de consulta y practica.</w:t>
+        <w:rPr>
+          <w:lang w:val="es-MX"/>
+        </w:rPr>
+      </w:pPr>
+      <w:r>
+        <w:rPr>
+          <w:lang w:val="es-MX"/>
+        </w:rPr>
+        <w:t xml:space="preserve">- Biblioteca </w:t>
+      </w:r>
+      <w:proofErr w:type="spellStart"/>
+      <w:r>
+        <w:rPr>
+          <w:lang w:val="es-MX"/>
+        </w:rPr>
+        <w:t>reune</w:t>
+      </w:r>
+      <w:proofErr w:type="spellEnd"/>
+      <w:r>
+        <w:rPr>
+          <w:lang w:val="es-MX"/>
+        </w:rPr>
+        <w:t xml:space="preserve"> recursos de consulta y </w:t>
+      </w:r>
+      <w:proofErr w:type="spellStart"/>
+      <w:r>
+        <w:rPr>
+          <w:lang w:val="es-MX"/>
+        </w:rPr>
+        <w:t>practica</w:t>
+      </w:r>
+      <w:proofErr w:type="spellEnd"/>
+      <w:r>
+        <w:rPr>
+          <w:lang w:val="es-MX"/>
+        </w:rPr>
+        <w:t>.</w:t>
       </w:r>
     </w:p>
     <w:p>
       <w:pPr>
         <w:pStyle w:val="ACCBullet"/>
-      </w:pPr>
-      <w:r>
-        <w:t>- Guia organiza el aprendizaje por modulo, submodulo, tema y subtema.</w:t>
+        <w:rPr>
+          <w:lang w:val="es-MX"/>
+        </w:rPr>
+      </w:pPr>
+      <w:r>
+        <w:rPr>
+          <w:lang w:val="es-MX"/>
+        </w:rPr>
+        <w:t xml:space="preserve">- </w:t>
+      </w:r>
+      <w:proofErr w:type="spellStart"/>
+      <w:r>
+        <w:rPr>
+          <w:lang w:val="es-MX"/>
+        </w:rPr>
+        <w:t>Guia</w:t>
+      </w:r>
+      <w:proofErr w:type="spellEnd"/>
+      <w:r>
+        <w:rPr>
+          <w:lang w:val="es-MX"/>
+        </w:rPr>
+        <w:t xml:space="preserve"> organiza el aprendizaje por modulo, </w:t>
+      </w:r>
+      <w:proofErr w:type="spellStart"/>
+      <w:r>
+        <w:rPr>
+          <w:lang w:val="es-MX"/>
+        </w:rPr>
+        <w:t>submodulo</w:t>
+      </w:r>
+      <w:proofErr w:type="spellEnd"/>
+      <w:r>
+        <w:rPr>
+          <w:lang w:val="es-MX"/>
+        </w:rPr>
+        <w:t>, tema y subtema.</w:t>
       </w:r>
     </w:p>
     <w:p>
       <w:pPr>
         <w:pStyle w:val="ACCBullet"/>
-      </w:pPr>
-      <w:r>
+        <w:rPr>
+          <w:lang w:val="es-MX"/>
+        </w:rPr>
+      </w:pPr>
+      <w:r>
+        <w:rPr>
+          <w:lang w:val="es-MX"/>
+        </w:rPr>
+        <w:lastRenderedPageBreak/>
         <w:t>- Agenda permite registrar tareas personales y revisar actividades asignadas.</w:t>
       </w:r>
     </w:p>
     <w:p>
       <w:pPr>
         <w:pStyle w:val="ACCBullet"/>
-      </w:pPr>
-      <w:r>
+        <w:rPr>
+          <w:lang w:val="es-MX"/>
+        </w:rPr>
+      </w:pPr>
+      <w:r>
+        <w:rPr>
+          <w:lang w:val="es-MX"/>
+        </w:rPr>
         <w:t>- Resumen centraliza progreso, evaluaciones y recomendaciones.</w:t>
       </w:r>
     </w:p>
     <w:p>
       <w:pPr>
         <w:pStyle w:val="ACCBody"/>
-      </w:pPr>
-      <w:r>
-        <w:t>ACC es una plataforma de aprendizaje de C# que integra seguimiento de avance, planeacion de tareas, recorrido guiado por contenidos, consulta de recursos y apoyo conversacional.</w:t>
+        <w:rPr>
+          <w:lang w:val="es-MX"/>
+        </w:rPr>
+      </w:pPr>
+      <w:r>
+        <w:rPr>
+          <w:lang w:val="es-MX"/>
+        </w:rPr>
+        <w:t xml:space="preserve">ACC es una plataforma de aprendizaje de C# que integra seguimiento de avance, </w:t>
+      </w:r>
+      <w:proofErr w:type="spellStart"/>
+      <w:r>
+        <w:rPr>
+          <w:lang w:val="es-MX"/>
+        </w:rPr>
+        <w:t>planeacion</w:t>
+      </w:r>
+      <w:proofErr w:type="spellEnd"/>
+      <w:r>
+        <w:rPr>
+          <w:lang w:val="es-MX"/>
+        </w:rPr>
+        <w:t xml:space="preserve"> de tareas, recorrido guiado por contenidos, consulta de recursos y apoyo conversacional.</w:t>
       </w:r>
     </w:p>
     <w:p>
       <w:pPr>
         <w:pStyle w:val="Heading2"/>
-      </w:pPr>
-      <w:r>
-        <w:t>Descripcion general</w:t>
-      </w:r>
-    </w:p>
-    <w:p>
-      <w:pPr/>
+        <w:rPr>
+          <w:lang w:val="es-MX"/>
+        </w:rPr>
+      </w:pPr>
+      <w:proofErr w:type="spellStart"/>
+      <w:r>
+        <w:rPr>
+          <w:lang w:val="es-MX"/>
+        </w:rPr>
+        <w:t>Descripcion</w:t>
+      </w:r>
+      <w:proofErr w:type="spellEnd"/>
+      <w:r>
+        <w:rPr>
+          <w:lang w:val="es-MX"/>
+        </w:rPr>
+        <w:t xml:space="preserve"> general</w:t>
+      </w:r>
+    </w:p>
+    <w:p>
+      <w:pPr>
+        <w:rPr>
+          <w:lang w:val="es-MX"/>
+        </w:rPr>
+      </w:pPr>
     </w:p>
     <w:p>
       <w:pPr>
         <w:pStyle w:val="ACCBullet"/>
-      </w:pPr>
-      <w:r>
-        <w:t>- Permitir microfono o notificaciones solo si deseas usar funciones del navegador que lo requieran.</w:t>
+        <w:rPr>
+          <w:lang w:val="es-MX"/>
+        </w:rPr>
+      </w:pPr>
+      <w:r>
+        <w:rPr>
+          <w:lang w:val="es-MX"/>
+        </w:rPr>
+        <w:t xml:space="preserve">- Permitir </w:t>
+      </w:r>
+      <w:proofErr w:type="spellStart"/>
+      <w:r>
+        <w:rPr>
+          <w:lang w:val="es-MX"/>
+        </w:rPr>
+        <w:t>microfono</w:t>
+      </w:r>
+      <w:proofErr w:type="spellEnd"/>
+      <w:r>
+        <w:rPr>
+          <w:lang w:val="es-MX"/>
+        </w:rPr>
+        <w:t xml:space="preserve"> o notificaciones solo si deseas usar funciones del navegador que lo requieran.</w:t>
       </w:r>
     </w:p>
     <w:p>
       <w:pPr>
         <w:pStyle w:val="ACCBullet"/>
-      </w:pPr>
-      <w:r>
-        <w:t>- Tener permiso para acceder al rol o al contenido academico asignado.</w:t>
+        <w:rPr>
+          <w:lang w:val="es-MX"/>
+        </w:rPr>
+      </w:pPr>
+      <w:r>
+        <w:rPr>
+          <w:lang w:val="es-MX"/>
+        </w:rPr>
+        <w:t xml:space="preserve">- Tener permiso para acceder al rol o al contenido </w:t>
+      </w:r>
+      <w:proofErr w:type="spellStart"/>
+      <w:r>
+        <w:rPr>
+          <w:lang w:val="es-MX"/>
+        </w:rPr>
+        <w:t>academico</w:t>
+      </w:r>
+      <w:proofErr w:type="spellEnd"/>
+      <w:r>
+        <w:rPr>
+          <w:lang w:val="es-MX"/>
+        </w:rPr>
+        <w:t xml:space="preserve"> asignado.</w:t>
       </w:r>
     </w:p>
     <w:p>
       <w:pPr>
         <w:pStyle w:val="ACCBullet"/>
-      </w:pPr>
-      <w:r>
+        <w:rPr>
+          <w:lang w:val="es-MX"/>
+        </w:rPr>
+      </w:pPr>
+      <w:r>
+        <w:rPr>
+          <w:lang w:val="es-MX"/>
+        </w:rPr>
         <w:t>- Usar un navegador web moderno con JavaScript habilitado.</w:t>
       </w:r>
     </w:p>
     <w:p>
       <w:pPr>
         <w:pStyle w:val="ACCBullet"/>
-      </w:pPr>
-      <w:r>
+        <w:rPr>
+          <w:lang w:val="es-MX"/>
+        </w:rPr>
+      </w:pPr>
+      <w:r>
+        <w:rPr>
+          <w:lang w:val="es-MX"/>
+        </w:rPr>
         <w:t>- Disponer de acceso a internet para cargar contenido, evaluaciones y servicios asociados.</w:t>
       </w:r>
     </w:p>
     <w:p>
       <w:pPr>
         <w:pStyle w:val="ACCBullet"/>
-      </w:pPr>
-      <w:r>
+        <w:rPr>
+          <w:lang w:val="es-MX"/>
+        </w:rPr>
+      </w:pPr>
+      <w:r>
+        <w:rPr>
+          <w:lang w:val="es-MX"/>
+        </w:rPr>
         <w:t>- Contar con una cuenta activa en ACC y credenciales vigentes.</w:t>
       </w:r>
     </w:p>
     <w:p>
       <w:pPr>
         <w:pStyle w:val="Heading2"/>
-      </w:pPr>
-      <w:r>
+        <w:rPr>
+          <w:lang w:val="es-MX"/>
+        </w:rPr>
+      </w:pPr>
+      <w:r>
+        <w:rPr>
+          <w:lang w:val="es-MX"/>
+        </w:rPr>
         <w:t>Requisitos previos</w:t>
       </w:r>
     </w:p>
     <w:p>
-      <w:pPr/>
+      <w:pPr>
+        <w:rPr>
+          <w:lang w:val="es-MX"/>
+        </w:rPr>
+      </w:pPr>
     </w:p>
     <w:p>
       <w:pPr>
         <w:pStyle w:val="ACCBody"/>
-      </w:pPr>
-      <w:r>
-        <w:t>El documento se concentra en las secciones Resumen, Agenda, Guia, Biblioteca, Charp y Cuenta. Los apartados asociados a otros roles, como Docentes, Aulas o Administracion, requieren documentacion complementaria segun el contexto de uso.</w:t>
+        <w:rPr>
+          <w:lang w:val="es-MX"/>
+        </w:rPr>
+      </w:pPr>
+      <w:r>
+        <w:rPr>
+          <w:lang w:val="es-MX"/>
+        </w:rPr>
+        <w:t xml:space="preserve">El documento se concentra en las secciones Resumen, Agenda, </w:t>
+      </w:r>
+      <w:proofErr w:type="spellStart"/>
+      <w:r>
+        <w:rPr>
+          <w:lang w:val="es-MX"/>
+        </w:rPr>
+        <w:t>Guia</w:t>
+      </w:r>
+      <w:proofErr w:type="spellEnd"/>
+      <w:r>
+        <w:rPr>
+          <w:lang w:val="es-MX"/>
+        </w:rPr>
+        <w:t xml:space="preserve">, Biblioteca, Charp y Cuenta. Los apartados asociados a otros roles, como Docentes, Aulas o </w:t>
+      </w:r>
+      <w:proofErr w:type="spellStart"/>
+      <w:r>
+        <w:rPr>
+          <w:lang w:val="es-MX"/>
+        </w:rPr>
+        <w:t>Administracion</w:t>
+      </w:r>
+      <w:proofErr w:type="spellEnd"/>
+      <w:r>
+        <w:rPr>
+          <w:lang w:val="es-MX"/>
+        </w:rPr>
+        <w:t xml:space="preserve">, requieren </w:t>
+      </w:r>
+      <w:proofErr w:type="spellStart"/>
+      <w:r>
+        <w:rPr>
+          <w:lang w:val="es-MX"/>
+        </w:rPr>
+        <w:t>documentacion</w:t>
+      </w:r>
+      <w:proofErr w:type="spellEnd"/>
+      <w:r>
+        <w:rPr>
+          <w:lang w:val="es-MX"/>
+        </w:rPr>
+        <w:t xml:space="preserve"> complementaria </w:t>
+      </w:r>
+      <w:proofErr w:type="spellStart"/>
+      <w:r>
+        <w:rPr>
+          <w:lang w:val="es-MX"/>
+        </w:rPr>
+        <w:t>segun</w:t>
+      </w:r>
+      <w:proofErr w:type="spellEnd"/>
+      <w:r>
+        <w:rPr>
+          <w:lang w:val="es-MX"/>
+        </w:rPr>
+        <w:t xml:space="preserve"> el contexto de uso.</w:t>
       </w:r>
     </w:p>
     <w:p>
       <w:pPr>
         <w:pStyle w:val="ACCBody"/>
-      </w:pPr>
-      <w:r>
-        <w:t>Esta guia de usuario describe el flujo principal de ACC para el rol de estudiante. Su objetivo es orientar el acceso, la navegacion y el uso cotidiano de las funciones visibles en la aplicacion.</w:t>
+        <w:rPr>
+          <w:lang w:val="es-MX"/>
+        </w:rPr>
+      </w:pPr>
+      <w:r>
+        <w:rPr>
+          <w:lang w:val="es-MX"/>
+        </w:rPr>
+        <w:t xml:space="preserve">Esta </w:t>
+      </w:r>
+      <w:proofErr w:type="spellStart"/>
+      <w:r>
+        <w:rPr>
+          <w:lang w:val="es-MX"/>
+        </w:rPr>
+        <w:t>guia</w:t>
+      </w:r>
+      <w:proofErr w:type="spellEnd"/>
+      <w:r>
+        <w:rPr>
+          <w:lang w:val="es-MX"/>
+        </w:rPr>
+        <w:t xml:space="preserve"> de usuario describe el flujo principal de ACC para el rol de estudiante. Su objetivo es orientar el acceso, la </w:t>
+      </w:r>
+      <w:proofErr w:type="spellStart"/>
+      <w:r>
+        <w:rPr>
+          <w:lang w:val="es-MX"/>
+        </w:rPr>
+        <w:t>navegacion</w:t>
+      </w:r>
+      <w:proofErr w:type="spellEnd"/>
+      <w:r>
+        <w:rPr>
+          <w:lang w:val="es-MX"/>
+        </w:rPr>
+        <w:t xml:space="preserve"> y el uso cotidiano de las funciones visibles en la </w:t>
+      </w:r>
+      <w:proofErr w:type="spellStart"/>
+      <w:r>
+        <w:rPr>
+          <w:lang w:val="es-MX"/>
+        </w:rPr>
+        <w:t>aplicacion</w:t>
+      </w:r>
+      <w:proofErr w:type="spellEnd"/>
+      <w:r>
+        <w:rPr>
+          <w:lang w:val="es-MX"/>
+        </w:rPr>
+        <w:t>.</w:t>
       </w:r>
     </w:p>
     <w:p>
       <w:pPr>
         <w:pStyle w:val="Heading2"/>
-      </w:pPr>
-      <w:r>
+        <w:rPr>
+          <w:lang w:val="es-MX"/>
+        </w:rPr>
+      </w:pPr>
+      <w:proofErr w:type="spellStart"/>
+      <w:r>
+        <w:rPr>
+          <w:lang w:val="es-MX"/>
+        </w:rPr>
         <w:t>Introduccion</w:t>
       </w:r>
-    </w:p>
-    <w:p>
-      <w:pPr/>
+      <w:proofErr w:type="spellEnd"/>
+    </w:p>
+    <w:p>
+      <w:pPr>
+        <w:rPr>
+          <w:lang w:val="es-MX"/>
+        </w:rPr>
+      </w:pPr>
     </w:p>
     <w:p>
       <w:pPr>
         <w:pStyle w:val="ACCBullet"/>
-      </w:pPr>
-      <w:r>
+        <w:rPr>
+          <w:lang w:val="es-MX"/>
+        </w:rPr>
+      </w:pPr>
+      <w:r>
+        <w:rPr>
+          <w:lang w:val="es-MX"/>
+        </w:rPr>
         <w:t>- Datos de contacto</w:t>
       </w:r>
     </w:p>
     <w:p>
       <w:pPr>
         <w:pStyle w:val="ACCBullet"/>
-      </w:pPr>
-      <w:r>
-        <w:t>- Apendices</w:t>
-      </w:r>
+        <w:rPr>
+          <w:lang w:val="es-MX"/>
+        </w:rPr>
+      </w:pPr>
+      <w:r>
+        <w:rPr>
+          <w:lang w:val="es-MX"/>
+        </w:rPr>
+        <w:t xml:space="preserve">- </w:t>
+      </w:r>
+      <w:proofErr w:type="spellStart"/>
+      <w:r>
+        <w:rPr>
+          <w:lang w:val="es-MX"/>
+        </w:rPr>
+        <w:t>Apendices</w:t>
+      </w:r>
+      <w:proofErr w:type="spellEnd"/>
     </w:p>
     <w:p>
       <w:pPr>
         <w:pStyle w:val="ACCBullet"/>
-      </w:pPr>
-      <w:r>
+        <w:rPr>
+          <w:lang w:val="es-MX"/>
+        </w:rPr>
+      </w:pPr>
+      <w:r>
+        <w:rPr>
+          <w:lang w:val="es-MX"/>
+        </w:rPr>
         <w:t>- Glosario</w:t>
       </w:r>
     </w:p>
     <w:p>
       <w:pPr>
         <w:pStyle w:val="ACCBullet"/>
-      </w:pPr>
-      <w:r>
-        <w:t>- Solucion de problemas</w:t>
+        <w:rPr>
+          <w:lang w:val="es-MX"/>
+        </w:rPr>
+      </w:pPr>
+      <w:r>
+        <w:rPr>
+          <w:lang w:val="es-MX"/>
+        </w:rPr>
+        <w:t xml:space="preserve">- </w:t>
+      </w:r>
+      <w:proofErr w:type="spellStart"/>
+      <w:r>
+        <w:rPr>
+          <w:lang w:val="es-MX"/>
+        </w:rPr>
+        <w:t>Solucion</w:t>
+      </w:r>
+      <w:proofErr w:type="spellEnd"/>
+      <w:r>
+        <w:rPr>
+          <w:lang w:val="es-MX"/>
+        </w:rPr>
+        <w:t xml:space="preserve"> de problemas</w:t>
       </w:r>
     </w:p>
     <w:p>
       <w:pPr>
         <w:pStyle w:val="ACCBullet"/>
-      </w:pPr>
-      <w:r>
-        <w:t>- Mantenimiento y actualizacion</w:t>
-      </w:r>
+        <w:rPr>
+          <w:lang w:val="es-MX"/>
+        </w:rPr>
+      </w:pPr>
+      <w:r>
+        <w:rPr>
+          <w:lang w:val="es-MX"/>
+        </w:rPr>
+        <w:t xml:space="preserve">- Mantenimiento y </w:t>
+      </w:r>
+      <w:proofErr w:type="spellStart"/>
+      <w:r>
+        <w:rPr>
+          <w:lang w:val="es-MX"/>
+        </w:rPr>
+        <w:t>actualizacion</w:t>
+      </w:r>
+      <w:proofErr w:type="spellEnd"/>
     </w:p>
     <w:p>
       <w:pPr>
         <w:pStyle w:val="ACCBullet"/>
-      </w:pPr>
-      <w:r>
-        <w:t>- Buenas practicas de uso</w:t>
+        <w:rPr>
+          <w:lang w:val="es-MX"/>
+        </w:rPr>
+      </w:pPr>
+      <w:r>
+        <w:rPr>
+          <w:lang w:val="es-MX"/>
+        </w:rPr>
+        <w:t xml:space="preserve">- Buenas </w:t>
+      </w:r>
+      <w:proofErr w:type="spellStart"/>
+      <w:r>
+        <w:rPr>
+          <w:lang w:val="es-MX"/>
+        </w:rPr>
+        <w:t>practicas</w:t>
+      </w:r>
+      <w:proofErr w:type="spellEnd"/>
+      <w:r>
+        <w:rPr>
+          <w:lang w:val="es-MX"/>
+        </w:rPr>
+        <w:t xml:space="preserve"> de uso</w:t>
       </w:r>
     </w:p>
     <w:p>
       <w:pPr>
         <w:pStyle w:val="ACCBullet"/>
-      </w:pPr>
-      <w:r>
+        <w:rPr>
+          <w:lang w:val="es-MX"/>
+        </w:rPr>
+      </w:pPr>
+      <w:r>
+        <w:rPr>
+          <w:lang w:val="es-MX"/>
+        </w:rPr>
         <w:t>- 6. Cuenta</w:t>
       </w:r>
     </w:p>
     <w:p>
       <w:pPr>
         <w:pStyle w:val="ACCBullet"/>
-      </w:pPr>
-      <w:r>
+        <w:rPr>
+          <w:lang w:val="es-MX"/>
+        </w:rPr>
+      </w:pPr>
+      <w:r>
+        <w:rPr>
+          <w:lang w:val="es-MX"/>
+        </w:rPr>
         <w:t>- 5. Charp</w:t>
       </w:r>
     </w:p>
     <w:p>
       <w:pPr>
         <w:pStyle w:val="ACCBullet"/>
-      </w:pPr>
-      <w:r>
+        <w:rPr>
+          <w:lang w:val="es-MX"/>
+        </w:rPr>
+      </w:pPr>
+      <w:r>
+        <w:rPr>
+          <w:lang w:val="es-MX"/>
+        </w:rPr>
         <w:t>- 4. Biblioteca</w:t>
       </w:r>
     </w:p>
     <w:p>
       <w:pPr>
         <w:pStyle w:val="ACCBullet"/>
-      </w:pPr>
-      <w:r>
-        <w:t>- 3. Guia</w:t>
-      </w:r>
+        <w:rPr>
+          <w:lang w:val="es-MX"/>
+        </w:rPr>
+      </w:pPr>
+      <w:r>
+        <w:rPr>
+          <w:lang w:val="es-MX"/>
+        </w:rPr>
+        <w:t xml:space="preserve">- 3. </w:t>
+      </w:r>
+      <w:proofErr w:type="spellStart"/>
+      <w:r>
+        <w:rPr>
+          <w:lang w:val="es-MX"/>
+        </w:rPr>
+        <w:t>Guia</w:t>
+      </w:r>
+      <w:proofErr w:type="spellEnd"/>
     </w:p>
     <w:p>
       <w:pPr>
         <w:pStyle w:val="ACCBullet"/>
-      </w:pPr>
-      <w:r>
+        <w:rPr>
+          <w:lang w:val="es-MX"/>
+        </w:rPr>
+      </w:pPr>
+      <w:r>
+        <w:rPr>
+          <w:lang w:val="es-MX"/>
+        </w:rPr>
         <w:t>- 2. Agenda</w:t>
       </w:r>
     </w:p>
     <w:p>
       <w:pPr>
         <w:pStyle w:val="ACCBullet"/>
-      </w:pPr>
-      <w:r>
+        <w:rPr>
+          <w:lang w:val="es-MX"/>
+        </w:rPr>
+      </w:pPr>
+      <w:r>
+        <w:rPr>
+          <w:lang w:val="es-MX"/>
+        </w:rPr>
+        <w:lastRenderedPageBreak/>
         <w:t>- 1. Resumen</w:t>
       </w:r>
     </w:p>
     <w:p>
       <w:pPr>
         <w:pStyle w:val="ACCBullet"/>
-      </w:pPr>
-      <w:r>
-        <w:t>- Guia de uso</w:t>
+        <w:rPr>
+          <w:lang w:val="es-MX"/>
+        </w:rPr>
+      </w:pPr>
+      <w:r>
+        <w:rPr>
+          <w:lang w:val="es-MX"/>
+        </w:rPr>
+        <w:t xml:space="preserve">- </w:t>
+      </w:r>
+      <w:proofErr w:type="spellStart"/>
+      <w:r>
+        <w:rPr>
+          <w:lang w:val="es-MX"/>
+        </w:rPr>
+        <w:t>Guia</w:t>
+      </w:r>
+      <w:proofErr w:type="spellEnd"/>
+      <w:r>
+        <w:rPr>
+          <w:lang w:val="es-MX"/>
+        </w:rPr>
+        <w:t xml:space="preserve"> de uso</w:t>
       </w:r>
     </w:p>
     <w:p>
       <w:pPr>
         <w:pStyle w:val="ACCBullet"/>
-      </w:pPr>
-      <w:r>
-        <w:t>- Descripcion general</w:t>
+        <w:rPr>
+          <w:lang w:val="es-MX"/>
+        </w:rPr>
+      </w:pPr>
+      <w:r>
+        <w:rPr>
+          <w:lang w:val="es-MX"/>
+        </w:rPr>
+        <w:t xml:space="preserve">- </w:t>
+      </w:r>
+      <w:proofErr w:type="spellStart"/>
+      <w:r>
+        <w:rPr>
+          <w:lang w:val="es-MX"/>
+        </w:rPr>
+        <w:t>Descripcion</w:t>
+      </w:r>
+      <w:proofErr w:type="spellEnd"/>
+      <w:r>
+        <w:rPr>
+          <w:lang w:val="es-MX"/>
+        </w:rPr>
+        <w:t xml:space="preserve"> general</w:t>
       </w:r>
     </w:p>
     <w:p>
       <w:pPr>
         <w:pStyle w:val="ACCBullet"/>
-      </w:pPr>
-      <w:r>
+        <w:rPr>
+          <w:lang w:val="es-MX"/>
+        </w:rPr>
+      </w:pPr>
+      <w:r>
+        <w:rPr>
+          <w:lang w:val="es-MX"/>
+        </w:rPr>
         <w:t>- Requisitos previos</w:t>
       </w:r>
     </w:p>
     <w:p>
       <w:pPr>
         <w:pStyle w:val="ACCBullet"/>
-      </w:pPr>
-      <w:r>
-        <w:t>- Introduccion</w:t>
-      </w:r>
+        <w:rPr>
+          <w:lang w:val="es-MX"/>
+        </w:rPr>
+      </w:pPr>
+      <w:r>
+        <w:rPr>
+          <w:lang w:val="es-MX"/>
+        </w:rPr>
+        <w:t xml:space="preserve">- </w:t>
+      </w:r>
+      <w:proofErr w:type="spellStart"/>
+      <w:r>
+        <w:rPr>
+          <w:lang w:val="es-MX"/>
+        </w:rPr>
+        <w:t>Introduccion</w:t>
+      </w:r>
+      <w:proofErr w:type="spellEnd"/>
     </w:p>
     <w:p>
       <w:pPr>
         <w:pStyle w:val="ACCBullet"/>
-      </w:pPr>
-      <w:r>
-        <w:t>- Indice</w:t>
-      </w:r>
+        <w:rPr>
+          <w:lang w:val="es-MX"/>
+        </w:rPr>
+      </w:pPr>
+      <w:r>
+        <w:rPr>
+          <w:lang w:val="es-MX"/>
+        </w:rPr>
+        <w:t xml:space="preserve">- </w:t>
+      </w:r>
+      <w:proofErr w:type="spellStart"/>
+      <w:r>
+        <w:rPr>
+          <w:lang w:val="es-MX"/>
+        </w:rPr>
+        <w:t>Indice</w:t>
+      </w:r>
+      <w:proofErr w:type="spellEnd"/>
     </w:p>
     <w:p>
       <w:pPr>
         <w:pStyle w:val="ACCBullet"/>
-      </w:pPr>
-      <w:r>
+        <w:rPr>
+          <w:lang w:val="es-MX"/>
+        </w:rPr>
+      </w:pPr>
+      <w:r>
+        <w:rPr>
+          <w:lang w:val="es-MX"/>
+        </w:rPr>
         <w:t>- Portada</w:t>
       </w:r>
     </w:p>
     <w:p>
       <w:pPr>
-        <w:pStyle w:val="Heading2"/>
-      </w:pPr>
-      <w:r>
-        <w:t>Indice</w:t>
+        <w:spacing w:after="200"/>
+        <w:jc w:val="left"/>
+        <w:rPr>
+          <w:rFonts w:asciiTheme="majorHAnsi" w:eastAsiaTheme="majorEastAsia" w:hAnsiTheme="majorHAnsi" w:cstheme="majorBidi"/>
+          <w:b/>
+          <w:bCs/>
+          <w:szCs w:val="26"/>
+          <w:lang w:val="es-MX"/>
+        </w:rPr>
+      </w:pPr>
+      <w:bookmarkStart w:id="5" w:name="_Toc223425485"/>
+      <w:r>
+        <w:rPr>
+          <w:lang w:val="es-MX"/>
+        </w:rPr>
+        <w:br w:type="page"/>
       </w:r>
     </w:p>
     <w:p>
@@ -4309,7 +4997,6 @@
           <w:lang w:val="es-MX"/>
         </w:rPr>
       </w:pPr>
-      <w:bookmarkStart w:id="5" w:name="_Toc223425485"/>
       <w:r>
         <w:rPr>
           <w:rFonts w:ascii="Times New Roman" w:eastAsia="Times New Roman" w:hAnsi="Times New Roman" w:cs="Times New Roman"/>
@@ -4317,6 +5004,7 @@
           <w:szCs w:val="24"/>
           <w:lang w:val="es-MX"/>
         </w:rPr>
+        <w:lastRenderedPageBreak/>
         <w:t>1. Resumen</w:t>
       </w:r>
       <w:bookmarkEnd w:id="5"/>
@@ -4372,7 +5060,7 @@
           <w:szCs w:val="24"/>
         </w:rPr>
         <w:drawing>
-          <wp:inline distT="0" distB="0" distL="0" distR="0" wp14:anchorId="5155AA06" wp14:editId="5E6892F3">
+          <wp:inline distT="0" distB="0" distL="0" distR="0" wp14:anchorId="221471B8" wp14:editId="055B727F">
             <wp:extent cx="5486400" cy="2772602"/>
             <wp:effectExtent l="0" t="0" r="0" b="0"/>
             <wp:docPr id="2" name="Picture 2"/>
@@ -4444,7 +5132,6 @@
           <w:szCs w:val="24"/>
           <w:lang w:val="es-MX"/>
         </w:rPr>
-        <w:lastRenderedPageBreak/>
         <w:t>Como usar</w:t>
       </w:r>
       <w:r>
@@ -4778,8 +5465,9 @@
           <w:noProof/>
           <w:szCs w:val="24"/>
         </w:rPr>
+        <w:lastRenderedPageBreak/>
         <w:drawing>
-          <wp:inline distT="0" distB="0" distL="0" distR="0" wp14:anchorId="6CDA6E42" wp14:editId="12C4CF18">
+          <wp:inline distT="0" distB="0" distL="0" distR="0" wp14:anchorId="2044182A" wp14:editId="6F5FD0EB">
             <wp:extent cx="5486400" cy="3587880"/>
             <wp:effectExtent l="0" t="0" r="0" b="0"/>
             <wp:docPr id="3" name="Picture 3"/>
@@ -4845,9 +5533,8 @@
           <w:noProof/>
           <w:szCs w:val="24"/>
         </w:rPr>
-        <w:lastRenderedPageBreak/>
         <w:drawing>
-          <wp:inline distT="0" distB="0" distL="0" distR="0" wp14:anchorId="23497B9A" wp14:editId="5517790B">
+          <wp:inline distT="0" distB="0" distL="0" distR="0" wp14:anchorId="49DEBEC5" wp14:editId="01496350">
             <wp:extent cx="5486400" cy="3511778"/>
             <wp:effectExtent l="0" t="0" r="0" b="0"/>
             <wp:docPr id="4" name="Picture 4"/>
@@ -4915,7 +5602,7 @@
         </w:rPr>
         <w:lastRenderedPageBreak/>
         <w:drawing>
-          <wp:inline distT="0" distB="0" distL="0" distR="0" wp14:anchorId="008B7A62" wp14:editId="01E2BDD9">
+          <wp:inline distT="0" distB="0" distL="0" distR="0" wp14:anchorId="77739C12" wp14:editId="29375E98">
             <wp:extent cx="5486400" cy="4559643"/>
             <wp:effectExtent l="0" t="0" r="0" b="0"/>
             <wp:docPr id="5" name="Picture 5"/>
@@ -5422,7 +6109,7 @@
           <w:szCs w:val="24"/>
         </w:rPr>
         <w:drawing>
-          <wp:inline distT="0" distB="0" distL="0" distR="0" wp14:anchorId="7299E2CE" wp14:editId="149EEE49">
+          <wp:inline distT="0" distB="0" distL="0" distR="0" wp14:anchorId="4C34BC91" wp14:editId="1E32EE3B">
             <wp:extent cx="5486400" cy="2744669"/>
             <wp:effectExtent l="0" t="0" r="0" b="0"/>
             <wp:docPr id="6" name="Picture 6"/>
@@ -5783,7 +6470,7 @@
         </w:rPr>
         <w:lastRenderedPageBreak/>
         <w:drawing>
-          <wp:inline distT="0" distB="0" distL="0" distR="0" wp14:anchorId="302831F9" wp14:editId="1111F3ED">
+          <wp:inline distT="0" distB="0" distL="0" distR="0" wp14:anchorId="22EA01F6" wp14:editId="0659FA82">
             <wp:extent cx="5486400" cy="3760604"/>
             <wp:effectExtent l="0" t="0" r="0" b="0"/>
             <wp:docPr id="7" name="Picture 7"/>
@@ -6067,7 +6754,7 @@
         </w:rPr>
         <w:lastRenderedPageBreak/>
         <w:drawing>
-          <wp:inline distT="0" distB="0" distL="0" distR="0" wp14:anchorId="78C79619" wp14:editId="1BD63678">
+          <wp:inline distT="0" distB="0" distL="0" distR="0" wp14:anchorId="44EC1349" wp14:editId="2FACAAFE">
             <wp:extent cx="5486400" cy="5486400"/>
             <wp:effectExtent l="0" t="0" r="0" b="0"/>
             <wp:docPr id="8" name="Picture 8"/>
@@ -6260,7 +6947,7 @@
         </w:rPr>
         <w:lastRenderedPageBreak/>
         <w:drawing>
-          <wp:inline distT="0" distB="0" distL="0" distR="0" wp14:anchorId="03F456F7" wp14:editId="4FB8EC24">
+          <wp:inline distT="0" distB="0" distL="0" distR="0" wp14:anchorId="0E289317" wp14:editId="459F9167">
             <wp:extent cx="5486400" cy="2015583"/>
             <wp:effectExtent l="0" t="0" r="0" b="0"/>
             <wp:docPr id="9" name="Picture 9"/>
@@ -6426,7 +7113,7 @@
           <w:szCs w:val="24"/>
         </w:rPr>
         <w:drawing>
-          <wp:inline distT="0" distB="0" distL="0" distR="0" wp14:anchorId="0447F394" wp14:editId="575827B7">
+          <wp:inline distT="0" distB="0" distL="0" distR="0" wp14:anchorId="1599F12A" wp14:editId="4DC59C71">
             <wp:extent cx="5486400" cy="2754948"/>
             <wp:effectExtent l="0" t="0" r="0" b="0"/>
             <wp:docPr id="10" name="Picture 10"/>
@@ -6492,6 +7179,28 @@
     </w:p>
     <w:p>
       <w:pPr>
+        <w:spacing w:after="200"/>
+        <w:jc w:val="left"/>
+        <w:rPr>
+          <w:rFonts w:cs="Times New Roman"/>
+          <w:b/>
+          <w:szCs w:val="24"/>
+          <w:lang w:val="es-MX"/>
+        </w:rPr>
+      </w:pPr>
+      <w:bookmarkStart w:id="13" w:name="_Toc223425493"/>
+      <w:r>
+        <w:rPr>
+          <w:rFonts w:cs="Times New Roman"/>
+          <w:bCs/>
+          <w:szCs w:val="24"/>
+          <w:lang w:val="es-MX"/>
+        </w:rPr>
+        <w:br w:type="page"/>
+      </w:r>
+    </w:p>
+    <w:p>
+      <w:pPr>
         <w:pStyle w:val="Heading3"/>
         <w:rPr>
           <w:rFonts w:ascii="Times New Roman" w:hAnsi="Times New Roman" w:cs="Times New Roman"/>
@@ -6500,7 +7209,6 @@
           <w:lang w:val="es-MX"/>
         </w:rPr>
       </w:pPr>
-      <w:bookmarkStart w:id="13" w:name="_Toc223425493"/>
       <w:r>
         <w:rPr>
           <w:rFonts w:ascii="Times New Roman" w:eastAsia="Times New Roman" w:hAnsi="Times New Roman" w:cs="Times New Roman"/>
@@ -6508,6 +7216,7 @@
           <w:szCs w:val="24"/>
           <w:lang w:val="es-MX"/>
         </w:rPr>
+        <w:lastRenderedPageBreak/>
         <w:t>Flujo recomendado</w:t>
       </w:r>
       <w:bookmarkEnd w:id="13"/>
@@ -6743,7 +7452,6 @@
           <w:szCs w:val="24"/>
           <w:lang w:val="es-MX"/>
         </w:rPr>
-        <w:lastRenderedPageBreak/>
         <w:t>7. Una vez cubiertos los requisitos, entra a las evaluaciones habilitadas.</w:t>
       </w:r>
     </w:p>
@@ -6762,7 +7470,7 @@
           <w:szCs w:val="24"/>
         </w:rPr>
         <w:drawing>
-          <wp:inline distT="0" distB="0" distL="0" distR="0" wp14:anchorId="6BF88519" wp14:editId="38170652">
+          <wp:inline distT="0" distB="0" distL="0" distR="0" wp14:anchorId="310F8021" wp14:editId="3AB34D1A">
             <wp:extent cx="5486400" cy="3454724"/>
             <wp:effectExtent l="0" t="0" r="0" b="0"/>
             <wp:docPr id="11" name="Picture 11"/>
@@ -6828,8 +7536,9 @@
           <w:noProof/>
           <w:szCs w:val="24"/>
         </w:rPr>
+        <w:lastRenderedPageBreak/>
         <w:drawing>
-          <wp:inline distT="0" distB="0" distL="0" distR="0" wp14:anchorId="665A438A" wp14:editId="2FDDF77A">
+          <wp:inline distT="0" distB="0" distL="0" distR="0" wp14:anchorId="0BA1B37E" wp14:editId="556FA278">
             <wp:extent cx="5486400" cy="3443591"/>
             <wp:effectExtent l="0" t="0" r="0" b="0"/>
             <wp:docPr id="12" name="Picture 12"/>
@@ -6920,117 +7629,117 @@
           <w:szCs w:val="24"/>
           <w:lang w:val="es-MX"/>
         </w:rPr>
+        <w:t>Estado de avance</w:t>
+      </w:r>
+      <w:bookmarkEnd w:id="14"/>
+    </w:p>
+    <w:p>
+      <w:pPr>
+        <w:pStyle w:val="ACCBullet"/>
+        <w:rPr>
+          <w:rFonts w:cs="Times New Roman"/>
+          <w:szCs w:val="24"/>
+          <w:lang w:val="es-MX"/>
+        </w:rPr>
+      </w:pPr>
+      <w:r>
+        <w:rPr>
+          <w:rFonts w:cs="Times New Roman"/>
+          <w:szCs w:val="24"/>
+          <w:lang w:val="es-MX"/>
+        </w:rPr>
+        <w:t xml:space="preserve">- Si un subtema </w:t>
+      </w:r>
+      <w:proofErr w:type="spellStart"/>
+      <w:r>
+        <w:rPr>
+          <w:rFonts w:cs="Times New Roman"/>
+          <w:szCs w:val="24"/>
+          <w:lang w:val="es-MX"/>
+        </w:rPr>
+        <w:t>aun</w:t>
+      </w:r>
+      <w:proofErr w:type="spellEnd"/>
+      <w:r>
+        <w:rPr>
+          <w:rFonts w:cs="Times New Roman"/>
+          <w:szCs w:val="24"/>
+          <w:lang w:val="es-MX"/>
+        </w:rPr>
+        <w:t xml:space="preserve"> no se completa, aparece el </w:t>
+      </w:r>
+      <w:proofErr w:type="spellStart"/>
+      <w:r>
+        <w:rPr>
+          <w:rFonts w:cs="Times New Roman"/>
+          <w:szCs w:val="24"/>
+          <w:lang w:val="es-MX"/>
+        </w:rPr>
+        <w:t>boton</w:t>
+      </w:r>
+      <w:proofErr w:type="spellEnd"/>
+      <w:r>
+        <w:rPr>
+          <w:rFonts w:cs="Times New Roman"/>
+          <w:szCs w:val="24"/>
+          <w:lang w:val="es-MX"/>
+        </w:rPr>
+        <w:t xml:space="preserve"> Completar.</w:t>
+      </w:r>
+    </w:p>
+    <w:p>
+      <w:pPr>
+        <w:pStyle w:val="ACCBullet"/>
+        <w:rPr>
+          <w:rFonts w:cs="Times New Roman"/>
+          <w:szCs w:val="24"/>
+          <w:lang w:val="es-MX"/>
+        </w:rPr>
+      </w:pPr>
+      <w:r>
+        <w:rPr>
+          <w:rFonts w:cs="Times New Roman"/>
+          <w:szCs w:val="24"/>
+          <w:lang w:val="es-MX"/>
+        </w:rPr>
+        <w:t>- Si ya fue cerrado correctamente, se muestra el estado Completado.</w:t>
+      </w:r>
+    </w:p>
+    <w:p>
+      <w:pPr>
+        <w:pStyle w:val="ACCBullet"/>
+        <w:rPr>
+          <w:rFonts w:cs="Times New Roman"/>
+          <w:szCs w:val="24"/>
+          <w:lang w:val="es-MX"/>
+        </w:rPr>
+      </w:pPr>
+      <w:r>
+        <w:rPr>
+          <w:rFonts w:cs="Times New Roman"/>
+          <w:szCs w:val="24"/>
+          <w:lang w:val="es-MX"/>
+        </w:rPr>
+        <w:t>- Usa los botones de flecha en la parte superior para volver o avanzar dentro del recorrido.</w:t>
+      </w:r>
+    </w:p>
+    <w:p>
+      <w:pPr>
+        <w:jc w:val="center"/>
+        <w:rPr>
+          <w:rFonts w:cs="Times New Roman"/>
+          <w:szCs w:val="24"/>
+        </w:rPr>
+      </w:pPr>
+      <w:r>
+        <w:rPr>
+          <w:rFonts w:cs="Times New Roman"/>
+          <w:noProof/>
+          <w:szCs w:val="24"/>
+        </w:rPr>
         <w:lastRenderedPageBreak/>
-        <w:t>Estado de avance</w:t>
-      </w:r>
-      <w:bookmarkEnd w:id="14"/>
-    </w:p>
-    <w:p>
-      <w:pPr>
-        <w:pStyle w:val="ACCBullet"/>
-        <w:rPr>
-          <w:rFonts w:cs="Times New Roman"/>
-          <w:szCs w:val="24"/>
-          <w:lang w:val="es-MX"/>
-        </w:rPr>
-      </w:pPr>
-      <w:r>
-        <w:rPr>
-          <w:rFonts w:cs="Times New Roman"/>
-          <w:szCs w:val="24"/>
-          <w:lang w:val="es-MX"/>
-        </w:rPr>
-        <w:t xml:space="preserve">- Si un subtema </w:t>
-      </w:r>
-      <w:proofErr w:type="spellStart"/>
-      <w:r>
-        <w:rPr>
-          <w:rFonts w:cs="Times New Roman"/>
-          <w:szCs w:val="24"/>
-          <w:lang w:val="es-MX"/>
-        </w:rPr>
-        <w:t>aun</w:t>
-      </w:r>
-      <w:proofErr w:type="spellEnd"/>
-      <w:r>
-        <w:rPr>
-          <w:rFonts w:cs="Times New Roman"/>
-          <w:szCs w:val="24"/>
-          <w:lang w:val="es-MX"/>
-        </w:rPr>
-        <w:t xml:space="preserve"> no se completa, aparece el </w:t>
-      </w:r>
-      <w:proofErr w:type="spellStart"/>
-      <w:r>
-        <w:rPr>
-          <w:rFonts w:cs="Times New Roman"/>
-          <w:szCs w:val="24"/>
-          <w:lang w:val="es-MX"/>
-        </w:rPr>
-        <w:t>boton</w:t>
-      </w:r>
-      <w:proofErr w:type="spellEnd"/>
-      <w:r>
-        <w:rPr>
-          <w:rFonts w:cs="Times New Roman"/>
-          <w:szCs w:val="24"/>
-          <w:lang w:val="es-MX"/>
-        </w:rPr>
-        <w:t xml:space="preserve"> Completar.</w:t>
-      </w:r>
-    </w:p>
-    <w:p>
-      <w:pPr>
-        <w:pStyle w:val="ACCBullet"/>
-        <w:rPr>
-          <w:rFonts w:cs="Times New Roman"/>
-          <w:szCs w:val="24"/>
-          <w:lang w:val="es-MX"/>
-        </w:rPr>
-      </w:pPr>
-      <w:r>
-        <w:rPr>
-          <w:rFonts w:cs="Times New Roman"/>
-          <w:szCs w:val="24"/>
-          <w:lang w:val="es-MX"/>
-        </w:rPr>
-        <w:t>- Si ya fue cerrado correctamente, se muestra el estado Completado.</w:t>
-      </w:r>
-    </w:p>
-    <w:p>
-      <w:pPr>
-        <w:pStyle w:val="ACCBullet"/>
-        <w:rPr>
-          <w:rFonts w:cs="Times New Roman"/>
-          <w:szCs w:val="24"/>
-          <w:lang w:val="es-MX"/>
-        </w:rPr>
-      </w:pPr>
-      <w:r>
-        <w:rPr>
-          <w:rFonts w:cs="Times New Roman"/>
-          <w:szCs w:val="24"/>
-          <w:lang w:val="es-MX"/>
-        </w:rPr>
-        <w:t>- Usa los botones de flecha en la parte superior para volver o avanzar dentro del recorrido.</w:t>
-      </w:r>
-    </w:p>
-    <w:p>
-      <w:pPr>
-        <w:jc w:val="center"/>
-        <w:rPr>
-          <w:rFonts w:cs="Times New Roman"/>
-          <w:szCs w:val="24"/>
-        </w:rPr>
-      </w:pPr>
-      <w:r>
-        <w:rPr>
-          <w:rFonts w:cs="Times New Roman"/>
-          <w:noProof/>
-          <w:szCs w:val="24"/>
-        </w:rPr>
         <w:drawing>
-          <wp:inline distT="0" distB="0" distL="0" distR="0" wp14:anchorId="716BBDD6" wp14:editId="4D5EB5A0">
+          <wp:inline distT="0" distB="0" distL="0" distR="0" wp14:anchorId="36B8AA30" wp14:editId="6565D00C">
             <wp:extent cx="5486400" cy="3427521"/>
             <wp:effectExtent l="0" t="0" r="0" b="0"/>
             <wp:docPr id="13" name="Picture 13"/>
@@ -7096,9 +7805,8 @@
           <w:noProof/>
           <w:szCs w:val="24"/>
         </w:rPr>
-        <w:lastRenderedPageBreak/>
         <w:drawing>
-          <wp:inline distT="0" distB="0" distL="0" distR="0" wp14:anchorId="456A90C5" wp14:editId="2440A0A6">
+          <wp:inline distT="0" distB="0" distL="0" distR="0" wp14:anchorId="0DEB49AF" wp14:editId="16767294">
             <wp:extent cx="5486400" cy="3453388"/>
             <wp:effectExtent l="0" t="0" r="0" b="0"/>
             <wp:docPr id="14" name="Picture 14"/>
@@ -7154,6 +7862,28 @@
     </w:p>
     <w:p>
       <w:pPr>
+        <w:spacing w:after="200"/>
+        <w:jc w:val="left"/>
+        <w:rPr>
+          <w:rFonts w:cs="Times New Roman"/>
+          <w:b/>
+          <w:szCs w:val="24"/>
+          <w:lang w:val="es-MX"/>
+        </w:rPr>
+      </w:pPr>
+      <w:bookmarkStart w:id="15" w:name="_Toc223425495"/>
+      <w:r>
+        <w:rPr>
+          <w:rFonts w:cs="Times New Roman"/>
+          <w:bCs/>
+          <w:szCs w:val="24"/>
+          <w:lang w:val="es-MX"/>
+        </w:rPr>
+        <w:br w:type="page"/>
+      </w:r>
+    </w:p>
+    <w:p>
+      <w:pPr>
         <w:pStyle w:val="Heading3"/>
         <w:rPr>
           <w:rFonts w:ascii="Times New Roman" w:hAnsi="Times New Roman" w:cs="Times New Roman"/>
@@ -7162,7 +7892,6 @@
           <w:lang w:val="es-MX"/>
         </w:rPr>
       </w:pPr>
-      <w:bookmarkStart w:id="15" w:name="_Toc223425495"/>
       <w:r>
         <w:rPr>
           <w:rFonts w:ascii="Times New Roman" w:eastAsia="Times New Roman" w:hAnsi="Times New Roman" w:cs="Times New Roman"/>
@@ -7170,6 +7899,7 @@
           <w:szCs w:val="24"/>
           <w:lang w:val="es-MX"/>
         </w:rPr>
+        <w:lastRenderedPageBreak/>
         <w:t>Evaluaciones</w:t>
       </w:r>
       <w:bookmarkEnd w:id="15"/>
@@ -7350,9 +8080,8 @@
           <w:noProof/>
           <w:szCs w:val="24"/>
         </w:rPr>
-        <w:lastRenderedPageBreak/>
         <w:drawing>
-          <wp:inline distT="0" distB="0" distL="0" distR="0" wp14:anchorId="5E5FB3EE" wp14:editId="18869112">
+          <wp:inline distT="0" distB="0" distL="0" distR="0" wp14:anchorId="59164D7D" wp14:editId="47A79751">
             <wp:extent cx="5486400" cy="3443877"/>
             <wp:effectExtent l="0" t="0" r="0" b="0"/>
             <wp:docPr id="15" name="Picture 15"/>
@@ -7418,6 +8147,28 @@
     </w:p>
     <w:p>
       <w:pPr>
+        <w:spacing w:after="200"/>
+        <w:jc w:val="left"/>
+        <w:rPr>
+          <w:rFonts w:cs="Times New Roman"/>
+          <w:b/>
+          <w:szCs w:val="24"/>
+          <w:lang w:val="es-MX"/>
+        </w:rPr>
+      </w:pPr>
+      <w:bookmarkStart w:id="16" w:name="_Toc223425496"/>
+      <w:r>
+        <w:rPr>
+          <w:rFonts w:cs="Times New Roman"/>
+          <w:bCs/>
+          <w:szCs w:val="24"/>
+          <w:lang w:val="es-MX"/>
+        </w:rPr>
+        <w:br w:type="page"/>
+      </w:r>
+    </w:p>
+    <w:p>
+      <w:pPr>
         <w:pStyle w:val="Heading2"/>
         <w:rPr>
           <w:rFonts w:ascii="Times New Roman" w:hAnsi="Times New Roman" w:cs="Times New Roman"/>
@@ -7426,7 +8177,6 @@
           <w:lang w:val="es-MX"/>
         </w:rPr>
       </w:pPr>
-      <w:bookmarkStart w:id="16" w:name="_Toc223425496"/>
       <w:r>
         <w:rPr>
           <w:rFonts w:ascii="Times New Roman" w:eastAsia="Times New Roman" w:hAnsi="Times New Roman" w:cs="Times New Roman"/>
@@ -7434,6 +8184,7 @@
           <w:szCs w:val="24"/>
           <w:lang w:val="es-MX"/>
         </w:rPr>
+        <w:lastRenderedPageBreak/>
         <w:t>4. Biblioteca</w:t>
       </w:r>
       <w:bookmarkEnd w:id="16"/>
@@ -7507,7 +8258,7 @@
           <w:szCs w:val="24"/>
         </w:rPr>
         <w:drawing>
-          <wp:inline distT="0" distB="0" distL="0" distR="0" wp14:anchorId="7D7830AF" wp14:editId="06F09EEA">
+          <wp:inline distT="0" distB="0" distL="0" distR="0" wp14:anchorId="0364CF47" wp14:editId="4D7089E5">
             <wp:extent cx="5486400" cy="2759362"/>
             <wp:effectExtent l="0" t="0" r="0" b="0"/>
             <wp:docPr id="16" name="Picture 16"/>
@@ -7579,7 +8330,6 @@
           <w:szCs w:val="24"/>
           <w:lang w:val="es-MX"/>
         </w:rPr>
-        <w:lastRenderedPageBreak/>
         <w:t>Como usarla</w:t>
       </w:r>
       <w:bookmarkEnd w:id="17"/>
@@ -7815,7 +8565,7 @@
           <w:szCs w:val="24"/>
         </w:rPr>
         <w:drawing>
-          <wp:inline distT="0" distB="0" distL="0" distR="0" wp14:anchorId="580D3BDE" wp14:editId="0EBE8AB8">
+          <wp:inline distT="0" distB="0" distL="0" distR="0" wp14:anchorId="7166EB62" wp14:editId="1460FC99">
             <wp:extent cx="5486400" cy="709066"/>
             <wp:effectExtent l="0" t="0" r="0" b="0"/>
             <wp:docPr id="17" name="Picture 17"/>
@@ -7881,6 +8631,29 @@
     </w:p>
     <w:p>
       <w:pPr>
+        <w:spacing w:after="200"/>
+        <w:jc w:val="left"/>
+        <w:rPr>
+          <w:rFonts w:cs="Times New Roman"/>
+          <w:b/>
+          <w:szCs w:val="24"/>
+          <w:lang w:val="es-MX"/>
+        </w:rPr>
+      </w:pPr>
+      <w:bookmarkStart w:id="18" w:name="_Toc223425498"/>
+      <w:r>
+        <w:rPr>
+          <w:rFonts w:cs="Times New Roman"/>
+          <w:bCs/>
+          <w:szCs w:val="24"/>
+          <w:lang w:val="es-MX"/>
+        </w:rPr>
+        <w:br w:type="page"/>
+      </w:r>
+    </w:p>
+    <w:bookmarkEnd w:id="18"/>
+    <w:p>
+      <w:pPr>
         <w:pStyle w:val="Heading3"/>
         <w:rPr>
           <w:rFonts w:ascii="Times New Roman" w:hAnsi="Times New Roman" w:cs="Times New Roman"/>
@@ -7889,7 +8662,6 @@
           <w:lang w:val="es-MX"/>
         </w:rPr>
       </w:pPr>
-      <w:bookmarkStart w:id="18" w:name="_Toc223425498"/>
       <w:r>
         <w:rPr>
           <w:rFonts w:ascii="Times New Roman" w:eastAsia="Times New Roman" w:hAnsi="Times New Roman" w:cs="Times New Roman"/>
@@ -7897,9 +8669,9 @@
           <w:szCs w:val="24"/>
           <w:lang w:val="es-MX"/>
         </w:rPr>
-        <w:t>Filtros laterales</w:t>
-      </w:r>
-      <w:bookmarkEnd w:id="18"/>
+        <w:lastRenderedPageBreak/>
+        <w:t>Barra de filtros de la biblioteca</w:t>
+      </w:r>
     </w:p>
     <w:p>
       <w:pPr>
@@ -7922,7 +8694,7 @@
           <w:szCs w:val="24"/>
         </w:rPr>
         <w:drawing>
-          <wp:anchor distT="0" distB="0" distL="114300" distR="114300" simplePos="0" relativeHeight="251658752" behindDoc="0" locked="0" layoutInCell="1" allowOverlap="1" wp14:anchorId="3EDC6ADE" wp14:editId="28FC9F11">
+          <wp:anchor distT="0" distB="0" distL="114300" distR="114300" simplePos="0" relativeHeight="251658752" behindDoc="0" locked="0" layoutInCell="1" allowOverlap="1" wp14:anchorId="67C745EF" wp14:editId="2E60D7F3">
             <wp:simplePos x="0" y="0"/>
             <wp:positionH relativeFrom="column">
               <wp:posOffset>4284286</wp:posOffset>
@@ -8171,7 +8943,7 @@
           <w:szCs w:val="24"/>
         </w:rPr>
         <w:drawing>
-          <wp:inline distT="0" distB="0" distL="0" distR="0" wp14:anchorId="7E6F0F89" wp14:editId="05B3FC1A">
+          <wp:inline distT="0" distB="0" distL="0" distR="0" wp14:anchorId="49FD545A" wp14:editId="1699D837">
             <wp:extent cx="5486400" cy="2765263"/>
             <wp:effectExtent l="0" t="0" r="0" b="0"/>
             <wp:docPr id="19" name="Picture 19"/>
@@ -8442,7 +9214,7 @@
           <w:szCs w:val="24"/>
         </w:rPr>
         <w:drawing>
-          <wp:inline distT="0" distB="0" distL="0" distR="0" wp14:anchorId="64DB1256" wp14:editId="435B637B">
+          <wp:inline distT="0" distB="0" distL="0" distR="0" wp14:anchorId="27086F74" wp14:editId="09A874D5">
             <wp:extent cx="5486400" cy="732900"/>
             <wp:effectExtent l="0" t="0" r="0" b="0"/>
             <wp:docPr id="20" name="Picture 20"/>
@@ -8714,7 +9486,7 @@
         </w:rPr>
         <w:lastRenderedPageBreak/>
         <w:drawing>
-          <wp:inline distT="0" distB="0" distL="0" distR="0" wp14:anchorId="2404314A" wp14:editId="4FE3A1EC">
+          <wp:inline distT="0" distB="0" distL="0" distR="0" wp14:anchorId="1E96D1FE" wp14:editId="1B02C31C">
             <wp:extent cx="5486400" cy="3813349"/>
             <wp:effectExtent l="0" t="0" r="0" b="0"/>
             <wp:docPr id="21" name="Picture 21"/>
@@ -8991,7 +9763,7 @@
           <w:szCs w:val="24"/>
         </w:rPr>
         <w:drawing>
-          <wp:inline distT="0" distB="0" distL="0" distR="0" wp14:anchorId="6AC7C3DB" wp14:editId="0CB1A2B2">
+          <wp:inline distT="0" distB="0" distL="0" distR="0" wp14:anchorId="5403C7BC" wp14:editId="30126AD6">
             <wp:extent cx="5486400" cy="2979370"/>
             <wp:effectExtent l="0" t="0" r="0" b="0"/>
             <wp:docPr id="22" name="Picture 22"/>
@@ -9616,7 +10388,7 @@
           <w:szCs w:val="24"/>
         </w:rPr>
         <w:drawing>
-          <wp:inline distT="0" distB="0" distL="0" distR="0" wp14:anchorId="15BB3D24" wp14:editId="4B254394">
+          <wp:inline distT="0" distB="0" distL="0" distR="0" wp14:anchorId="4D997107" wp14:editId="1291F8DB">
             <wp:extent cx="5486400" cy="2348392"/>
             <wp:effectExtent l="0" t="0" r="0" b="0"/>
             <wp:docPr id="23" name="Picture 23"/>
@@ -10061,7 +10833,7 @@
           <w:szCs w:val="24"/>
         </w:rPr>
         <w:drawing>
-          <wp:inline distT="0" distB="0" distL="0" distR="0" wp14:anchorId="6F9E52C3" wp14:editId="27DA066A">
+          <wp:inline distT="0" distB="0" distL="0" distR="0" wp14:anchorId="05049ED6" wp14:editId="1D4E30D7">
             <wp:extent cx="5486400" cy="2194560"/>
             <wp:effectExtent l="0" t="0" r="0" b="0"/>
             <wp:docPr id="24" name="Picture 24"/>
@@ -10129,7 +10901,7 @@
         </w:rPr>
         <w:lastRenderedPageBreak/>
         <w:drawing>
-          <wp:inline distT="0" distB="0" distL="0" distR="0" wp14:anchorId="7234E8D8" wp14:editId="72D5AC96">
+          <wp:inline distT="0" distB="0" distL="0" distR="0" wp14:anchorId="5BB46B51" wp14:editId="3385D9A5">
             <wp:extent cx="5486400" cy="3577110"/>
             <wp:effectExtent l="0" t="0" r="0" b="0"/>
             <wp:docPr id="25" name="Picture 25"/>
@@ -10366,7 +11138,7 @@
           <w:szCs w:val="24"/>
         </w:rPr>
         <w:drawing>
-          <wp:inline distT="0" distB="0" distL="0" distR="0" wp14:anchorId="0A4AFC18" wp14:editId="79B5D319">
+          <wp:inline distT="0" distB="0" distL="0" distR="0" wp14:anchorId="30FB52E7" wp14:editId="34A83818">
             <wp:extent cx="5486400" cy="2357031"/>
             <wp:effectExtent l="0" t="0" r="0" b="0"/>
             <wp:docPr id="26" name="Picture 26"/>
@@ -10602,7 +11374,7 @@
           <w:szCs w:val="24"/>
         </w:rPr>
         <w:drawing>
-          <wp:inline distT="0" distB="0" distL="0" distR="0" wp14:anchorId="4F7050A1" wp14:editId="22D215B8">
+          <wp:inline distT="0" distB="0" distL="0" distR="0" wp14:anchorId="347CB1D5" wp14:editId="2EBF0C4D">
             <wp:extent cx="5486400" cy="2489796"/>
             <wp:effectExtent l="0" t="0" r="0" b="0"/>
             <wp:docPr id="27" name="Picture 27"/>
@@ -10866,7 +11638,7 @@
           <w:szCs w:val="24"/>
         </w:rPr>
         <w:drawing>
-          <wp:inline distT="0" distB="0" distL="0" distR="0" wp14:anchorId="7097F687" wp14:editId="10D98C36">
+          <wp:inline distT="0" distB="0" distL="0" distR="0" wp14:anchorId="7247AA3B" wp14:editId="425A857B">
             <wp:extent cx="5486400" cy="1308683"/>
             <wp:effectExtent l="0" t="0" r="0" b="0"/>
             <wp:docPr id="28" name="Picture 28"/>
@@ -11700,6 +12472,28 @@
     </w:p>
     <w:p>
       <w:pPr>
+        <w:spacing w:after="200"/>
+        <w:jc w:val="left"/>
+        <w:rPr>
+          <w:rFonts w:eastAsiaTheme="majorEastAsia" w:cs="Times New Roman"/>
+          <w:b/>
+          <w:bCs/>
+          <w:szCs w:val="24"/>
+          <w:lang w:val="es-MX"/>
+        </w:rPr>
+      </w:pPr>
+      <w:bookmarkStart w:id="34" w:name="_Toc223425514"/>
+      <w:r>
+        <w:rPr>
+          <w:rFonts w:cs="Times New Roman"/>
+          <w:szCs w:val="24"/>
+          <w:lang w:val="es-MX"/>
+        </w:rPr>
+        <w:br w:type="page"/>
+      </w:r>
+    </w:p>
+    <w:p>
+      <w:pPr>
         <w:pStyle w:val="Heading2"/>
         <w:rPr>
           <w:rFonts w:ascii="Times New Roman" w:hAnsi="Times New Roman" w:cs="Times New Roman"/>
@@ -11707,13 +12501,13 @@
           <w:lang w:val="es-MX"/>
         </w:rPr>
       </w:pPr>
-      <w:bookmarkStart w:id="34" w:name="_Toc223425514"/>
       <w:r>
         <w:rPr>
           <w:rFonts w:ascii="Times New Roman" w:hAnsi="Times New Roman" w:cs="Times New Roman"/>
           <w:szCs w:val="24"/>
           <w:lang w:val="es-MX"/>
         </w:rPr>
+        <w:lastRenderedPageBreak/>
         <w:t>Glosario</w:t>
       </w:r>
       <w:bookmarkEnd w:id="34"/>
@@ -11733,7 +12527,15 @@
           <w:szCs w:val="24"/>
           <w:lang w:val="es-MX"/>
         </w:rPr>
-        <w:t>- ACC: plataforma de aprendizaje enfocada en el estudio guiado de C#.</w:t>
+        <w:t>- ACC:</w:t>
+      </w:r>
+      <w:r>
+        <w:rPr>
+          <w:rFonts w:cs="Times New Roman"/>
+          <w:szCs w:val="24"/>
+          <w:lang w:val="es-MX"/>
+        </w:rPr>
+        <w:t xml:space="preserve"> Aprendiendo C# con Charp</w:t>
       </w:r>
     </w:p>
     <w:p>
@@ -11771,6 +12573,50 @@
         </w:rPr>
         <w:t>.</w:t>
       </w:r>
+      <w:r>
+        <w:rPr>
+          <w:rFonts w:cs="Times New Roman"/>
+          <w:szCs w:val="24"/>
+          <w:lang w:val="es-MX"/>
+        </w:rPr>
+        <w:t xml:space="preserve"> </w:t>
+      </w:r>
+      <w:proofErr w:type="spellStart"/>
+      <w:r>
+        <w:rPr>
+          <w:rFonts w:cs="Times New Roman"/>
+          <w:szCs w:val="24"/>
+          <w:lang w:val="es-MX"/>
+        </w:rPr>
+        <w:t>Csharp</w:t>
+      </w:r>
+      <w:proofErr w:type="spellEnd"/>
+      <w:r>
+        <w:rPr>
+          <w:rFonts w:cs="Times New Roman"/>
+          <w:szCs w:val="24"/>
+          <w:lang w:val="es-MX"/>
+        </w:rPr>
+        <w:t xml:space="preserve"> + </w:t>
+      </w:r>
+      <w:proofErr w:type="spellStart"/>
+      <w:r>
+        <w:rPr>
+          <w:rFonts w:cs="Times New Roman"/>
+          <w:szCs w:val="24"/>
+          <w:lang w:val="es-MX"/>
+        </w:rPr>
+        <w:t>Shark</w:t>
+      </w:r>
+      <w:proofErr w:type="spellEnd"/>
+      <w:r>
+        <w:rPr>
+          <w:rFonts w:cs="Times New Roman"/>
+          <w:szCs w:val="24"/>
+          <w:lang w:val="es-MX"/>
+        </w:rPr>
+        <w:t xml:space="preserve"> = Charp. </w:t>
+      </w:r>
     </w:p>
     <w:p>
       <w:pPr>
@@ -11967,7 +12813,6 @@
           <w:szCs w:val="24"/>
           <w:lang w:val="es-MX"/>
         </w:rPr>
-        <w:lastRenderedPageBreak/>
         <w:t xml:space="preserve">- 2FA: </w:t>
       </w:r>
       <w:proofErr w:type="spellStart"/>
@@ -12553,74 +13398,21 @@
     </w:p>
     <w:p>
       <w:pPr>
-        <w:pStyle w:val="ACCBullet"/>
-        <w:rPr>
-          <w:rFonts w:cs="Times New Roman"/>
-          <w:szCs w:val="24"/>
-          <w:lang w:val="es-MX"/>
-        </w:rPr>
-      </w:pPr>
-      <w:r>
-        <w:rPr>
-          <w:rFonts w:cs="Times New Roman"/>
-          <w:szCs w:val="24"/>
-          <w:lang w:val="es-MX"/>
-        </w:rPr>
-        <w:t xml:space="preserve">- Seguimiento y soporte: utilizar el canal </w:t>
-      </w:r>
-      <w:proofErr w:type="spellStart"/>
-      <w:r>
-        <w:rPr>
-          <w:rFonts w:cs="Times New Roman"/>
-          <w:szCs w:val="24"/>
-          <w:lang w:val="es-MX"/>
-        </w:rPr>
-        <w:t>academico</w:t>
-      </w:r>
-      <w:proofErr w:type="spellEnd"/>
-      <w:r>
-        <w:rPr>
-          <w:rFonts w:cs="Times New Roman"/>
-          <w:szCs w:val="24"/>
-          <w:lang w:val="es-MX"/>
-        </w:rPr>
-        <w:t xml:space="preserve"> o institucional definido para la </w:t>
-      </w:r>
-      <w:proofErr w:type="spellStart"/>
-      <w:r>
-        <w:rPr>
-          <w:rFonts w:cs="Times New Roman"/>
-          <w:szCs w:val="24"/>
-          <w:lang w:val="es-MX"/>
-        </w:rPr>
-        <w:t>operacion</w:t>
-      </w:r>
-      <w:proofErr w:type="spellEnd"/>
-      <w:r>
-        <w:rPr>
-          <w:rFonts w:cs="Times New Roman"/>
-          <w:szCs w:val="24"/>
-          <w:lang w:val="es-MX"/>
-        </w:rPr>
-        <w:t xml:space="preserve"> de ACC-</w:t>
-      </w:r>
-      <w:proofErr w:type="spellStart"/>
-      <w:r>
-        <w:rPr>
-          <w:rFonts w:cs="Times New Roman"/>
-          <w:szCs w:val="24"/>
-          <w:lang w:val="es-MX"/>
-        </w:rPr>
-        <w:t>Complex</w:t>
-      </w:r>
-      <w:proofErr w:type="spellEnd"/>
-      <w:r>
-        <w:rPr>
-          <w:rFonts w:cs="Times New Roman"/>
-          <w:szCs w:val="24"/>
-          <w:lang w:val="es-MX"/>
-        </w:rPr>
-        <w:t>.</w:t>
+        <w:spacing w:after="200"/>
+        <w:jc w:val="left"/>
+        <w:rPr>
+          <w:rFonts w:cs="Times New Roman"/>
+          <w:szCs w:val="24"/>
+          <w:lang w:val="es-MX"/>
+        </w:rPr>
+      </w:pPr>
+      <w:r>
+        <w:rPr>
+          <w:rFonts w:cs="Times New Roman"/>
+          <w:szCs w:val="24"/>
+          <w:lang w:val="es-MX"/>
+        </w:rPr>
+        <w:br w:type="page"/>
       </w:r>
     </w:p>
     <w:p>
@@ -12637,49 +13429,12 @@
       <w:r>
         <w:rPr>
           <w:rFonts w:cs="Times New Roman"/>
-          <w:szCs w:val="24"/>
-          <w:lang w:val="es-MX"/>
-        </w:rPr>
-        <w:t xml:space="preserve">- Al reportar una incidencia, incluye modulo afectado, </w:t>
-      </w:r>
-      <w:proofErr w:type="spellStart"/>
-      <w:r>
-        <w:rPr>
-          <w:rFonts w:cs="Times New Roman"/>
-          <w:szCs w:val="24"/>
-          <w:lang w:val="es-MX"/>
-        </w:rPr>
-        <w:t>accion</w:t>
-      </w:r>
-      <w:proofErr w:type="spellEnd"/>
-      <w:r>
-        <w:rPr>
-          <w:rFonts w:cs="Times New Roman"/>
-          <w:szCs w:val="24"/>
-          <w:lang w:val="es-MX"/>
-        </w:rPr>
-        <w:t xml:space="preserve"> realizada y resultado observado.</w:t>
-      </w:r>
-    </w:p>
-    <w:p>
-      <w:pPr>
-        <w:pStyle w:val="ACCBullet"/>
-        <w:rPr>
-          <w:rFonts w:cs="Times New Roman"/>
           <w:b/>
           <w:bCs/>
           <w:szCs w:val="24"/>
           <w:lang w:val="es-MX"/>
         </w:rPr>
-      </w:pPr>
-      <w:r>
-        <w:rPr>
-          <w:rFonts w:cs="Times New Roman"/>
-          <w:b/>
-          <w:bCs/>
-          <w:szCs w:val="24"/>
-          <w:lang w:val="es-MX"/>
-        </w:rPr>
+        <w:lastRenderedPageBreak/>
         <w:t>Contacto directo</w:t>
       </w:r>
       <w:r>

</xml_diff>